<commit_message>
feat: 느루의 대화 AI를 DeepSeek로 전환 (위기 턴만 OpenAI gpt-4o) · 구독 1개월 9,900원 / 12개월 79,000원
- 비교용 상담사 '우렁의사' 삭제(느루에 합침), 재치 턴의 상위 모델 승격 폐지
- 개인정보 국외이전에 DeepSeek(중국) 추가 — 처리방침 표·설명, 동의 항목 문구, 동의 버전 v3(기존 이용자 재동의)
- 결제창·마이 구독 카드에 1개월/12개월 두 상품, 약관·운영자 콘솔·팀 소개·질문지·준비안내 문구 · build 217

Co-Authored-By: Claude Fable 5.1 <noreply@anthropic.com>
</commit_message>
<xml_diff>
--- a/legal/법인_보험_세무_준비안내.docx
+++ b/legal/법인_보험_세무_준비안내.docx
@@ -3829,6 +3829,113 @@
                 <w:rFonts w:ascii="맑은 고딕" w:cs="맑은 고딕" w:eastAsia="맑은 고딕" w:hAnsi="맑은 고딕"/>
               </w:rPr>
               <w:t xml:space="preserve">조직 정보·결제 수단을 법인으로 변경</w:t>
+            </w:r>
+          </w:p>
+        </w:tc>
+        <w:tc>
+          <w:tcPr>
+            <w:tcW w:type="dxa" w:w="1000"/>
+            <w:tcBorders>
+              <w:top w:val="single" w:color="999999" w:sz="4"/>
+              <w:left w:val="single" w:color="999999" w:sz="4"/>
+              <w:bottom w:val="single" w:color="999999" w:sz="4"/>
+              <w:right w:val="single" w:color="999999" w:sz="4"/>
+            </w:tcBorders>
+            <w:tcMar>
+              <w:top w:type="dxa" w:w="60"/>
+              <w:left w:type="dxa" w:w="100"/>
+              <w:bottom w:type="dxa" w:w="60"/>
+              <w:right w:type="dxa" w:w="100"/>
+            </w:tcMar>
+            <w:vAlign w:val="center"/>
+          </w:tcPr>
+          <w:p>
+            <w:pPr>
+              <w:spacing w:before="0" w:after="0" w:line="300"/>
+              <w:jc w:val="left"/>
+            </w:pPr>
+            <w:r>
+              <w:rPr>
+                <w:b w:val="false"/>
+                <w:bCs w:val="false"/>
+                <w:sz w:val="19"/>
+                <w:szCs w:val="19"/>
+                <w:rFonts w:ascii="맑은 고딕" w:cs="맑은 고딕" w:eastAsia="맑은 고딕" w:hAnsi="맑은 고딕"/>
+              </w:rPr>
+              <w:t xml:space="preserve">☐</w:t>
+            </w:r>
+          </w:p>
+        </w:tc>
+      </w:tr>
+      <w:tr>
+        <w:trPr>
+          <w:cantSplit/>
+        </w:trPr>
+        <w:tc>
+          <w:tcPr>
+            <w:tcW w:type="dxa" w:w="2800"/>
+            <w:tcBorders>
+              <w:top w:val="single" w:color="999999" w:sz="4"/>
+              <w:left w:val="single" w:color="999999" w:sz="4"/>
+              <w:bottom w:val="single" w:color="999999" w:sz="4"/>
+              <w:right w:val="single" w:color="999999" w:sz="4"/>
+            </w:tcBorders>
+            <w:tcMar>
+              <w:top w:type="dxa" w:w="60"/>
+              <w:left w:type="dxa" w:w="100"/>
+              <w:bottom w:type="dxa" w:w="60"/>
+              <w:right w:type="dxa" w:w="100"/>
+            </w:tcMar>
+            <w:vAlign w:val="center"/>
+          </w:tcPr>
+          <w:p>
+            <w:pPr>
+              <w:spacing w:before="0" w:after="0" w:line="300"/>
+              <w:jc w:val="left"/>
+            </w:pPr>
+            <w:r>
+              <w:rPr>
+                <w:b w:val="false"/>
+                <w:bCs w:val="false"/>
+                <w:sz w:val="19"/>
+                <w:szCs w:val="19"/>
+                <w:rFonts w:ascii="맑은 고딕" w:cs="맑은 고딕" w:eastAsia="맑은 고딕" w:hAnsi="맑은 고딕"/>
+              </w:rPr>
+              <w:t xml:space="preserve">DeepSeek API 계정</w:t>
+            </w:r>
+          </w:p>
+        </w:tc>
+        <w:tc>
+          <w:tcPr>
+            <w:tcW w:type="dxa" w:w="5226"/>
+            <w:tcBorders>
+              <w:top w:val="single" w:color="999999" w:sz="4"/>
+              <w:left w:val="single" w:color="999999" w:sz="4"/>
+              <w:bottom w:val="single" w:color="999999" w:sz="4"/>
+              <w:right w:val="single" w:color="999999" w:sz="4"/>
+            </w:tcBorders>
+            <w:tcMar>
+              <w:top w:type="dxa" w:w="60"/>
+              <w:left w:type="dxa" w:w="100"/>
+              <w:bottom w:type="dxa" w:w="60"/>
+              <w:right w:type="dxa" w:w="100"/>
+            </w:tcMar>
+            <w:vAlign w:val="center"/>
+          </w:tcPr>
+          <w:p>
+            <w:pPr>
+              <w:spacing w:before="0" w:after="0" w:line="300"/>
+              <w:jc w:val="left"/>
+            </w:pPr>
+            <w:r>
+              <w:rPr>
+                <w:b w:val="false"/>
+                <w:bCs w:val="false"/>
+                <w:sz w:val="19"/>
+                <w:szCs w:val="19"/>
+                <w:rFonts w:ascii="맑은 고딕" w:cs="맑은 고딕" w:eastAsia="맑은 고딕" w:hAnsi="맑은 고딕"/>
+              </w:rPr>
+              <w:t xml:space="preserve">법인으로 변경 · 모델 학습 사용 거부(옵트아웃) 설정 확인</w:t>
             </w:r>
           </w:p>
         </w:tc>

</xml_diff>